<commit_message>
docs(paper): add keywords, trim cover letter, rebuild DOCX/PDF
Add a keywords line after the abstract, remove the length/scope query from the
comments-to-editor cover letter, and regenerate the AMS DOCX and PDF.
</commit_message>
<xml_diff>
--- a/paper/paper-ams.docx
+++ b/paper/paper-ams.docx
@@ -113,6 +113,30 @@
       </w:r>
       <w:r>
         <w:t xml:space="preserve">evolvable-strategy models. The model and all experiments are open source and reproducible.</w:t>
+      </w:r>
+    </w:p>
+    <w:p>
+      <w:pPr>
+        <w:pStyle w:val="BodyText"/>
+      </w:pPr>
+      <w:r>
+        <w:rPr>
+          <w:b/>
+          <w:bCs/>
+        </w:rPr>
+        <w:t xml:space="preserve">Keywords:</w:t>
+      </w:r>
+      <w:r>
+        <w:t xml:space="preserve"> </w:t>
+      </w:r>
+      <w:r>
+        <w:t xml:space="preserve">agent-based modeling; evolution of cooperation; resource-trading mutualism;</w:t>
+      </w:r>
+      <w:r>
+        <w:t xml:space="preserve"> </w:t>
+      </w:r>
+      <w:r>
+        <w:t xml:space="preserve">plant–fungi symbiosis; resilience threshold; reproducible simulation.</w:t>
       </w:r>
     </w:p>
     <w:bookmarkEnd w:id="9"/>

</xml_diff>